<commit_message>
Finalize EpiST-Shield SoftwareX manuscript, align latency benchmarks, update Faridpur district list, add bulletin disclaimer watermark, and finalize author response letter
</commit_message>
<xml_diff>
--- a/EpiST-Shield_SoftwareX_Manuscript.docx
+++ b/EpiST-Shield_SoftwareX_Manuscript.docx
@@ -805,7 +805,7 @@
                 <w:color w:val="000000"/>
                 <w:sz w:val="18"/>
               </w:rPr>
-              <w:t>https://dengu-forcasting.vercel.app/</w:t>
+              <w:t>https://github.com/Mosharrof8097/Dengu-forcasting#readme</w:t>
             </w:r>
           </w:p>
         </w:tc>
@@ -972,7 +972,7 @@
           <w:color w:val="000000"/>
           <w:sz w:val="24"/>
         </w:rPr>
-        <w:t>2.1 Software architecture</w:t>
+        <w:t>2.1 Software architecture and fault-tolerant design</w:t>
       </w:r>
     </w:p>
     <w:p>
@@ -985,7 +985,33 @@
           <w:color w:val="000000"/>
           <w:sz w:val="22"/>
         </w:rPr>
-        <w:t>EpiST-Shield is deployed live and publicly accessible at https://dengu-forcasting.vercel.app/. The platform follows a decoupled, client-server web architecture designed for low latency, zero client-side installation overhead, and cross-device compatibility (Figure 1).</w:t>
+        <w:t>EpiST-Shield is deployed live and publicly accessible at https://dengu-forcasting.vercel.app/. The platform follows a decoupled client-server web architecture consisting of a browser-based frontend and a FastAPI backend service responsible for forecast generation and resource estimation (Figure 1). The primary forecasting pipeline uses the pre-trained EpiST-Former model, while additional fallback mechanisms are implemented to maintain degraded service continuity when either primary model inference or backend connectivity becomes unavailable.</w:t>
+      </w:r>
+    </w:p>
+    <w:p>
+      <w:pPr>
+        <w:spacing w:after="120" w:line="276" w:lineRule="auto"/>
+      </w:pPr>
+      <w:r>
+        <w:rPr>
+          <w:rFonts w:ascii="Arial" w:hAnsi="Arial"/>
+          <w:color w:val="000000"/>
+          <w:sz w:val="22"/>
+        </w:rPr>
+        <w:t>The fault-tolerant architecture operates at two independent levels. At the server level, a backend mathematical fallback is activated when the primary EpiST-Former inference pipeline cannot produce a valid result. At the client level, an offline fallback mechanism is activated when the frontend cannot obtain a valid forecast response from the backend API. These mechanisms are coupled with explicit forecast-source tracking to ensure that users can distinguish primary deep-learning forecasts from fallback-generated estimates.</w:t>
+      </w:r>
+    </w:p>
+    <w:p>
+      <w:pPr>
+        <w:spacing w:after="120" w:line="276" w:lineRule="auto"/>
+      </w:pPr>
+      <w:r>
+        <w:rPr>
+          <w:rFonts w:ascii="Arial" w:hAnsi="Arial"/>
+          <w:color w:val="000000"/>
+          <w:sz w:val="22"/>
+        </w:rPr>
+        <w:t>For successful backend communication, the API response includes the metadata attributes forecast_source and fallback_active. The forecast_source field identifies whether the returned forecast was generated by the primary EpiST-Former model or by the backend mathematical fallback, while fallback_active indicates whether a degraded fallback mode was used. When the backend itself is unreachable, the frontend generates a client-side fallback estimate and locally assigns the corresponding forecast-source state (forecast_source = 'client_mathematical_fallback', fallback_active = true).</w:t>
       </w:r>
     </w:p>
     <w:p>
@@ -996,7 +1022,7 @@
       <w:r>
         <w:drawing>
           <wp:inline xmlns:a="http://schemas.openxmlformats.org/drawingml/2006/main" xmlns:pic="http://schemas.openxmlformats.org/drawingml/2006/picture">
-            <wp:extent cx="5303520" cy="3535680"/>
+            <wp:extent cx="5303520" cy="3397607"/>
             <wp:docPr id="1" name="Picture 1"/>
             <wp:cNvGraphicFramePr>
               <a:graphicFrameLocks noChangeAspect="1"/>
@@ -1017,7 +1043,7 @@
                   <pic:spPr>
                     <a:xfrm>
                       <a:off x="0" y="0"/>
-                      <a:ext cx="5303520" cy="3535680"/>
+                      <a:ext cx="5303520" cy="3397607"/>
                     </a:xfrm>
                     <a:prstGeom prst="rect"/>
                   </pic:spPr>
@@ -1040,7 +1066,7 @@
           <w:color w:val="000000"/>
           <w:sz w:val="19"/>
         </w:rPr>
-        <w:t>Fig. 1. Software architecture topology of EpiST-Shield detailing the Presentation Layer (HTML5/CSS3/JS/Leaflet), REST API Layer (FastAPI/Uvicorn), and Deep Learning Inference Core (EpiST-Former).</w:t>
+        <w:t>Fig. 1. Multi-layer fault-tolerant architecture and forecast-source transparency mechanism of EpiST-Shield. The backend mathematical fallback and client-side offline fallback represent independent failure-handling paths for model-inference and backend-connectivity failures, respectively.</w:t>
       </w:r>
     </w:p>
     <w:p>
@@ -1053,20 +1079,7 @@
           <w:color w:val="000000"/>
           <w:sz w:val="22"/>
         </w:rPr>
-        <w:t>The presentation layer is built with modern lightweight web technologies (HTML5, Vanilla CSS3 with glassmorphism design tokens, and modular ES6+ JavaScript), rendered dynamically in the client's web browser. Client-side state management coordinates dynamic Chart.js time-series plots, interactive Leaflet.js geospatial risk maps, dynamic weather sliders, and native browser PDF generation.</w:t>
-      </w:r>
-    </w:p>
-    <w:p>
-      <w:pPr>
-        <w:spacing w:after="120" w:line="276" w:lineRule="auto"/>
-      </w:pPr>
-      <w:r>
-        <w:rPr>
-          <w:rFonts w:ascii="Arial" w:hAnsi="Arial"/>
-          <w:color w:val="000000"/>
-          <w:sz w:val="22"/>
-        </w:rPr>
-        <w:t>The backend web service is implemented in Python 3.12 using FastAPI and an asynchronous Uvicorn ASGI server. Model inference is executed via a pre-trained Keras/TensorFlow deep learning core (epist_former_model.keras), which ingests a 14-channel spatiotemporal input tensor (6 biological channels, 6 meteorological channels from NASA POWER/BMD, and 2 static demographic channels from BBS Census 2022).</w:t>
+        <w:t>As illustrated in Fig. 1, the backend mathematical fallback and client-side offline fallback represent independent failure-handling paths. The server-side fallback is activated when primary model inference is unavailable or fails, whereas the client-side fallback is activated when the frontend cannot obtain a valid forecast response from the backend. The resulting forecast source is explicitly communicated to the user interface to distinguish live EpiST-Former forecasts from degraded fallback continuity estimates.</w:t>
       </w:r>
     </w:p>
     <w:p>
@@ -1080,7 +1093,370 @@
           <w:color w:val="000000"/>
           <w:sz w:val="24"/>
         </w:rPr>
-        <w:t>2.2 Software functionalities</w:t>
+        <w:t>2.2 Backend engine and API interface specification</w:t>
+      </w:r>
+    </w:p>
+    <w:p>
+      <w:pPr>
+        <w:spacing w:after="120" w:line="276" w:lineRule="auto"/>
+      </w:pPr>
+      <w:r>
+        <w:rPr>
+          <w:rFonts w:ascii="Arial" w:hAnsi="Arial"/>
+          <w:color w:val="000000"/>
+          <w:sz w:val="22"/>
+        </w:rPr>
+        <w:t>The primary forecasting functionality is exposed through a RESTful API powered by FastAPI. The following example illustrates a representative multi-horizon forecast request (POST /api/forecast/multi-horizon) and the corresponding structured response returned by the backend:</w:t>
+      </w:r>
+    </w:p>
+    <w:p>
+      <w:pPr>
+        <w:spacing w:after="120" w:line="276" w:lineRule="auto"/>
+      </w:pPr>
+      <w:r>
+        <w:rPr>
+          <w:rFonts w:ascii="Arial" w:hAnsi="Arial"/>
+          <w:b/>
+          <w:color w:val="000000"/>
+          <w:sz w:val="22"/>
+        </w:rPr>
+        <w:t xml:space="preserve">API Specification: </w:t>
+      </w:r>
+      <w:r>
+        <w:rPr>
+          <w:rFonts w:ascii="Arial" w:hAnsi="Arial"/>
+          <w:color w:val="000000"/>
+          <w:sz w:val="22"/>
+        </w:rPr>
+        <w:t>Sample Request: POST /api/forecast/multi-horizon</w:t>
+        <w:br/>
+        <w:t>{</w:t>
+        <w:br/>
+        <w:t xml:space="preserve">  "district": "Mymensingh",</w:t>
+        <w:br/>
+        <w:t xml:space="preserve">  "horizon_days": 30</w:t>
+        <w:br/>
+        <w:t>}</w:t>
+        <w:br/>
+        <w:br/>
+        <w:t>Sample Response (200 OK):</w:t>
+        <w:br/>
+        <w:t>{</w:t>
+        <w:br/>
+        <w:t xml:space="preserve">  "status": "success",</w:t>
+        <w:br/>
+        <w:t xml:space="preserve">  "district": "Mymensingh",</w:t>
+        <w:br/>
+        <w:t xml:space="preserve">  "forecast_horizon_days": 30,</w:t>
+        <w:br/>
+        <w:t xml:space="preserve">  "forecast_source": "epist_former",</w:t>
+        <w:br/>
+        <w:t xml:space="preserve">  "fallback_active": false,</w:t>
+        <w:br/>
+        <w:t xml:space="preserve">  "risk_level": "HIGH",</w:t>
+        <w:br/>
+        <w:t xml:space="preserve">  "predicted_cumulative_cases": 1722,</w:t>
+        <w:br/>
+        <w:t xml:space="preserve">  "peak_day": 18</w:t>
+        <w:br/>
+        <w:t>}</w:t>
+      </w:r>
+    </w:p>
+    <w:p>
+      <w:pPr>
+        <w:spacing w:before="200" w:after="80"/>
+      </w:pPr>
+      <w:r>
+        <w:rPr>
+          <w:rFonts w:ascii="Arial" w:hAnsi="Arial"/>
+          <w:b/>
+          <w:color w:val="000000"/>
+          <w:sz w:val="24"/>
+        </w:rPr>
+        <w:t>2.3 Backend mathematical fallback mechanism</w:t>
+      </w:r>
+    </w:p>
+    <w:p>
+      <w:pPr>
+        <w:spacing w:after="120" w:line="276" w:lineRule="auto"/>
+      </w:pPr>
+      <w:r>
+        <w:rPr>
+          <w:rFonts w:ascii="Arial" w:hAnsi="Arial"/>
+          <w:color w:val="000000"/>
+          <w:sz w:val="22"/>
+        </w:rPr>
+        <w:t>The backend mathematical fallback is activated when the primary EpiST-Former inference pipeline cannot produce a valid forecast. Triggering conditions include unavailable TensorFlow dependencies, failure to load the pre-trained model, and exceptions occurring during model inference. Instead of terminating the forecast request, the backend generates a deterministic substitute estimate using district-specific baseline case levels, meteorological inputs, and lagged dengue incidence.</w:t>
+      </w:r>
+    </w:p>
+    <w:p>
+      <w:pPr>
+        <w:spacing w:after="120" w:line="276" w:lineRule="auto"/>
+      </w:pPr>
+      <w:r>
+        <w:rPr>
+          <w:rFonts w:ascii="Arial" w:hAnsi="Arial"/>
+          <w:b/>
+          <w:color w:val="000000"/>
+          <w:sz w:val="22"/>
+        </w:rPr>
+        <w:t xml:space="preserve">Equation (1): </w:t>
+      </w:r>
+      <w:r>
+        <w:rPr>
+          <w:rFonts w:ascii="Arial" w:hAnsi="Arial"/>
+          <w:color w:val="000000"/>
+          <w:sz w:val="22"/>
+        </w:rPr>
+        <w:t>Cd = max(5.0, round(B_dist + (R_7d / 8.5) + (T_7d - 25.0) * 1.2 + 0.4 * L_7, 1))</w:t>
+      </w:r>
+    </w:p>
+    <w:p>
+      <w:pPr>
+        <w:spacing w:after="120" w:line="276" w:lineRule="auto"/>
+      </w:pPr>
+      <w:r>
+        <w:rPr>
+          <w:rFonts w:ascii="Arial" w:hAnsi="Arial"/>
+          <w:color w:val="000000"/>
+          <w:sz w:val="22"/>
+        </w:rPr>
+        <w:t>where B_dist denotes the district-specific baseline case level, R_7d represents the rainfall input used by the fallback routine, T_7d denotes the corresponding temperature input, and L_7 represents the lagged dengue-case input. This deterministic mathematical estimation rule is intended to provide degraded operational continuity when primary neural-model inference is unavailable. Accordingly, outputs generated through this mechanism are explicitly identified as backend mathematical fallback estimates rather than EpiST-Former forecasts.</w:t>
+      </w:r>
+    </w:p>
+    <w:p>
+      <w:pPr>
+        <w:spacing w:before="200" w:after="80"/>
+      </w:pPr>
+      <w:r>
+        <w:rPr>
+          <w:rFonts w:ascii="Arial" w:hAnsi="Arial"/>
+          <w:b/>
+          <w:color w:val="000000"/>
+          <w:sz w:val="24"/>
+        </w:rPr>
+        <w:t>2.4 Client-side offline fallback mechanism</w:t>
+      </w:r>
+    </w:p>
+    <w:p>
+      <w:pPr>
+        <w:spacing w:after="120" w:line="276" w:lineRule="auto"/>
+      </w:pPr>
+      <w:r>
+        <w:rPr>
+          <w:rFonts w:ascii="Arial" w:hAnsi="Arial"/>
+          <w:color w:val="000000"/>
+          <w:sz w:val="22"/>
+        </w:rPr>
+        <w:t>A second, independent fallback layer is implemented in the frontend to preserve basic dashboard availability when the forecast API cannot be reached. This mechanism is activated when an API request fails or times out, the backend service is unreachable, or a valid forecast response cannot be obtained. Under these conditions, the frontend executes the generateFallbackForecastData() routine to generate a deterministic substitute trajectory locally.</w:t>
+      </w:r>
+    </w:p>
+    <w:p>
+      <w:pPr>
+        <w:spacing w:after="120" w:line="276" w:lineRule="auto"/>
+      </w:pPr>
+      <w:r>
+        <w:rPr>
+          <w:rFonts w:ascii="Arial" w:hAnsi="Arial"/>
+          <w:b/>
+          <w:color w:val="000000"/>
+          <w:sz w:val="22"/>
+        </w:rPr>
+        <w:t xml:space="preserve">Equation (2): </w:t>
+      </w:r>
+      <w:r>
+        <w:rPr>
+          <w:rFonts w:ascii="Arial" w:hAnsi="Arial"/>
+          <w:color w:val="000000"/>
+          <w:sz w:val="22"/>
+        </w:rPr>
+        <w:t>Wd = 0.55 + 0.50 * exp(-((d - P)^2) / (2 * sigma^2)) + 0.05 * sin(0.8 * d)</w:t>
+      </w:r>
+    </w:p>
+    <w:p>
+      <w:pPr>
+        <w:spacing w:after="120" w:line="276" w:lineRule="auto"/>
+      </w:pPr>
+      <w:r>
+        <w:rPr>
+          <w:rFonts w:ascii="Arial" w:hAnsi="Arial"/>
+          <w:color w:val="000000"/>
+          <w:sz w:val="22"/>
+        </w:rPr>
+        <w:t>where d denotes the forecast-day index, P denotes the horizon-dependent peak index, and sigma = N / 4.0, where N is the selected forecast horizon. The daily fallback case estimate is subsequently obtained by scaling the district-specific baseline case level: Cd = max(5.0, round(B_district * Wd, 1)). This client-side mechanism is intended to preserve basic visualization and interface continuity during temporary loss of backend connectivity. Because these locally generated values are not produced by the EpiST-Former model, they are explicitly labeled as offline fallback continuity estimates and are not presented as live neural-model forecasts.</w:t>
+      </w:r>
+    </w:p>
+    <w:p>
+      <w:pPr>
+        <w:spacing w:before="200" w:after="80"/>
+      </w:pPr>
+      <w:r>
+        <w:rPr>
+          <w:rFonts w:ascii="Arial" w:hAnsi="Arial"/>
+          <w:b/>
+          <w:color w:val="000000"/>
+          <w:sz w:val="24"/>
+        </w:rPr>
+        <w:t>2.5 Forecast source transparency and decision safety</w:t>
+      </w:r>
+    </w:p>
+    <w:p>
+      <w:pPr>
+        <w:spacing w:after="120" w:line="276" w:lineRule="auto"/>
+      </w:pPr>
+      <w:r>
+        <w:rPr>
+          <w:rFonts w:ascii="Arial" w:hAnsi="Arial"/>
+          <w:color w:val="000000"/>
+          <w:sz w:val="22"/>
+        </w:rPr>
+        <w:t>Because EpiST-Shield provides forecast-driven information for public-health resource planning (hospital beds: 3.0 x peak daily cases, NS1 test kits: 1.8 x total cases, IV saline bags: 2.5 x total cases), fallback-generated values must not be visually indistinguishable from primary deep-learning forecasts. The system therefore implements explicit forecast-source transparency through three user-visible operational states: (1) EpiST-Former Live Model (indicates primary deep-learning inference pipeline is active), (2) Backend Mathematical Fallback (indicates backend returned a response using deterministic mathematical fallback), and (3) Client-Side Offline Fallback (indicates frontend generated a local continuity estimate). The active forecast source is displayed through a persistent visual status indicator in the dashboard navigation header (Green: EpiST-Former Live Model, Yellow: Backend Mathematical Fallback, Red/Orange: Offline Fallback Mode). When either fallback mode is active, an additional warning banner is displayed above resource-planning components, informing users that displayed estimates are derived from fallback data and should not be interpreted as live EpiST-Former model recommendations. The forecast-source information is also included in exported reports (such as executive PDF bulletins) to preserve traceability and support downstream interpretation of displayed results.</w:t>
+      </w:r>
+    </w:p>
+    <w:p>
+      <w:pPr>
+        <w:spacing w:before="200" w:after="80"/>
+      </w:pPr>
+      <w:r>
+        <w:rPr>
+          <w:rFonts w:ascii="Arial" w:hAnsi="Arial"/>
+          <w:b/>
+          <w:color w:val="000000"/>
+          <w:sz w:val="24"/>
+        </w:rPr>
+        <w:t>2.6 Resource Allocation Recommendations and Parameter Status</w:t>
+      </w:r>
+    </w:p>
+    <w:p>
+      <w:pPr>
+        <w:spacing w:after="120" w:line="276" w:lineRule="auto"/>
+      </w:pPr>
+      <w:r>
+        <w:rPr>
+          <w:rFonts w:ascii="Arial" w:hAnsi="Arial"/>
+          <w:color w:val="000000"/>
+          <w:sz w:val="22"/>
+        </w:rPr>
+        <w:t>EpiST-Shield includes a forecast-based resource estimation component to translate predicted dengue burden into approximate operational planning quantities. In the current implementation, resource requirements are calculated using predefined rule-based conversion multipliers. The required hospital-bed capacity is estimated from the peak predicted daily case count, whereas diagnostic-kit and intravenous-saline requirements are estimated from the cumulative predicted case count over the selected forecast horizon.</w:t>
+      </w:r>
+    </w:p>
+    <w:p>
+      <w:pPr>
+        <w:spacing w:after="120" w:line="276" w:lineRule="auto"/>
+      </w:pPr>
+      <w:r>
+        <w:rPr>
+          <w:rFonts w:ascii="Arial" w:hAnsi="Arial"/>
+          <w:b/>
+          <w:color w:val="000000"/>
+          <w:sz w:val="22"/>
+        </w:rPr>
+        <w:t xml:space="preserve">Equation (3): </w:t>
+      </w:r>
+      <w:r>
+        <w:rPr>
+          <w:rFonts w:ascii="Arial" w:hAnsi="Arial"/>
+          <w:color w:val="000000"/>
+          <w:sz w:val="22"/>
+        </w:rPr>
+        <w:t>B_req = 3.0 * C_peak</w:t>
+      </w:r>
+    </w:p>
+    <w:p>
+      <w:pPr>
+        <w:spacing w:after="120" w:line="276" w:lineRule="auto"/>
+      </w:pPr>
+      <w:r>
+        <w:rPr>
+          <w:rFonts w:ascii="Arial" w:hAnsi="Arial"/>
+          <w:b/>
+          <w:color w:val="000000"/>
+          <w:sz w:val="22"/>
+        </w:rPr>
+        <w:t xml:space="preserve">Equation (4): </w:t>
+      </w:r>
+      <w:r>
+        <w:rPr>
+          <w:rFonts w:ascii="Arial" w:hAnsi="Arial"/>
+          <w:color w:val="000000"/>
+          <w:sz w:val="22"/>
+        </w:rPr>
+        <w:t>K_req = 1.8 * C_total</w:t>
+      </w:r>
+    </w:p>
+    <w:p>
+      <w:pPr>
+        <w:spacing w:after="120" w:line="276" w:lineRule="auto"/>
+      </w:pPr>
+      <w:r>
+        <w:rPr>
+          <w:rFonts w:ascii="Arial" w:hAnsi="Arial"/>
+          <w:b/>
+          <w:color w:val="000000"/>
+          <w:sz w:val="22"/>
+        </w:rPr>
+        <w:t xml:space="preserve">Equation (5): </w:t>
+      </w:r>
+      <w:r>
+        <w:rPr>
+          <w:rFonts w:ascii="Arial" w:hAnsi="Arial"/>
+          <w:color w:val="000000"/>
+          <w:sz w:val="22"/>
+        </w:rPr>
+        <w:t>S_req = 2.5 * C_total</w:t>
+      </w:r>
+    </w:p>
+    <w:p>
+      <w:pPr>
+        <w:spacing w:after="120" w:line="276" w:lineRule="auto"/>
+      </w:pPr>
+      <w:r>
+        <w:rPr>
+          <w:rFonts w:ascii="Arial" w:hAnsi="Arial"/>
+          <w:color w:val="000000"/>
+          <w:sz w:val="22"/>
+        </w:rPr>
+        <w:t>where B_req, K_req, and S_req denote the estimated requirements for hospital beds, diagnostic kits, and intravenous saline bags, respectively; C_peak denotes the peak predicted daily case count; and C_total denotes the cumulative predicted case count over the selected forecast horizon.</w:t>
+      </w:r>
+    </w:p>
+    <w:p>
+      <w:pPr>
+        <w:spacing w:after="120" w:line="276" w:lineRule="auto"/>
+      </w:pPr>
+      <w:r>
+        <w:rPr>
+          <w:rFonts w:ascii="Arial" w:hAnsi="Arial"/>
+          <w:color w:val="000000"/>
+          <w:sz w:val="22"/>
+        </w:rPr>
+        <w:t>The conversion factors of 3.0, 1.8, and 2.5 are predefined illustrative planning parameters in the current software implementation and are not presented as universal or clinically validated standards. They are intended to demonstrate the translation of forecast outputs into interpretable resource-planning quantities within the deployed application. Consequently, the generated values should be interpreted as preliminary forecast-based planning estimates rather than validated operational prescriptions.</w:t>
+      </w:r>
+    </w:p>
+    <w:p>
+      <w:pPr>
+        <w:spacing w:after="120" w:line="276" w:lineRule="auto"/>
+      </w:pPr>
+      <w:r>
+        <w:rPr>
+          <w:rFonts w:ascii="Arial" w:hAnsi="Arial"/>
+          <w:color w:val="000000"/>
+          <w:sz w:val="22"/>
+        </w:rPr>
+        <w:t>Before formal operational deployment, these parameters should be calibrated against district-specific hospitalization patterns, diagnostic-testing demand, and empirical intravenous-fluid consumption data, together with applicable local clinical management protocols. Future work will focus on data-driven calibration and prospective validation of the resource-conversion parameters to support district-specific operational use.</w:t>
+      </w:r>
+    </w:p>
+    <w:p>
+      <w:pPr>
+        <w:spacing w:before="200" w:after="80"/>
+      </w:pPr>
+      <w:r>
+        <w:rPr>
+          <w:rFonts w:ascii="Arial" w:hAnsi="Arial"/>
+          <w:b/>
+          <w:color w:val="000000"/>
+          <w:sz w:val="24"/>
+        </w:rPr>
+        <w:t>2.7 Software functionalities</w:t>
       </w:r>
     </w:p>
     <w:p>
@@ -1292,7 +1668,7 @@
       <w:r>
         <w:drawing>
           <wp:inline xmlns:a="http://schemas.openxmlformats.org/drawingml/2006/main" xmlns:pic="http://schemas.openxmlformats.org/drawingml/2006/picture">
-            <wp:extent cx="5303520" cy="7271493"/>
+            <wp:extent cx="5303520" cy="7259318"/>
             <wp:docPr id="4" name="Picture 4"/>
             <wp:cNvGraphicFramePr>
               <a:graphicFrameLocks noChangeAspect="1"/>
@@ -1313,7 +1689,7 @@
                   <pic:spPr>
                     <a:xfrm>
                       <a:off x="0" y="0"/>
-                      <a:ext cx="5303520" cy="7271493"/>
+                      <a:ext cx="5303520" cy="7259318"/>
                     </a:xfrm>
                     <a:prstGeom prst="rect"/>
                   </pic:spPr>
@@ -1336,7 +1712,7 @@
           <w:color w:val="000000"/>
           <w:sz w:val="19"/>
         </w:rPr>
-        <w:t>Fig. 4. Automated executive PDF bulletin report output generated by the client-side reporting engine for DGHS public health decision-makers.</w:t>
+        <w:t>Fig. 4. Automated executive PDF bulletin report output generated by the client-side reporting engine. Note: This bulletin is a synthetic/illustrative example generated for system demonstration purposes only and does not represent an official report reviewed or endorsed by the Directorate General of Health Services (DGHS).</w:t>
       </w:r>
     </w:p>
     <w:p>
@@ -1350,7 +1726,7 @@
           <w:color w:val="000000"/>
           <w:sz w:val="24"/>
         </w:rPr>
-        <w:t>2.3 Sample code snippets analysis</w:t>
+        <w:t>2.6 Sample code snippets analysis</w:t>
       </w:r>
     </w:p>
     <w:p>
@@ -1363,7 +1739,7 @@
           <w:color w:val="000000"/>
           <w:sz w:val="22"/>
         </w:rPr>
-        <w:t>Below is a key backend snippet from main.py demonstrating the high-performance FastAPI endpoint handling inference and prescriptive resource calculations:</w:t>
+        <w:t>Below is a key backend snippet from main.py demonstrating the high-performance FastAPI endpoint handling model inference, fallback evaluation, metadata tagging, and prescriptive resource calculations:</w:t>
       </w:r>
     </w:p>
     <w:p>
@@ -1377,65 +1753,70 @@
           <w:color w:val="1E1E1E"/>
           <w:sz w:val="19"/>
         </w:rPr>
-        <w:t>@app.post("/predict")</w:t>
+        <w:t>def run_model_inference(district: str, rainfall: float, temp: float, humidity: float, lag7: float, lag14: float, lag21: float):</w:t>
         <w:br/>
-        <w:t>async def predict_outbreak(request: ForecastRequest):</w:t>
+        <w:t xml:space="preserve">    # Try primary deep learning model inference (EpiST-Former)</w:t>
         <w:br/>
-        <w:t xml:space="preserve">    # 1. Extract parameters &amp; load district spatial index</w:t>
+        <w:t xml:space="preserve">    if HAS_TF and model is not None:</w:t>
         <w:br/>
-        <w:t xml:space="preserve">    d_idx = DISTRICT_MAP[request.district]</w:t>
+        <w:t xml:space="preserve">        try:</w:t>
         <w:br/>
-        <w:t xml:space="preserve">    h_len = request.forecast_horizon  # 7, 14, 21, or 30 days</w:t>
+        <w:t xml:space="preserve">            bio_seq, weather_seq = preprocess_inputs(district, rainfall, temp, humidity, lag7, lag14, lag21)</w:t>
+        <w:br/>
+        <w:t xml:space="preserve">            raw_pred = float(model.predict([bio_seq, weather_seq], verbose=0)[0][0])</w:t>
+        <w:br/>
+        <w:t xml:space="preserve">            if raw_pred &gt; 0:</w:t>
+        <w:br/>
+        <w:t xml:space="preserve">                return raw_pred, False # (Prediction Value, is_fallback=False)</w:t>
+        <w:br/>
+        <w:t xml:space="preserve">        except Exception:</w:t>
+        <w:br/>
+        <w:t xml:space="preserve">            pass</w:t>
+        <w:br/>
+        <w:t xml:space="preserve">            </w:t>
+        <w:br/>
+        <w:t xml:space="preserve">    # Backend Mathematical Fallback Engine</w:t>
+        <w:br/>
+        <w:t xml:space="preserve">    base = DISTRICT_BASE_CASES.get(district, 40.0)</w:t>
+        <w:br/>
+        <w:t xml:space="preserve">    fallback_val = base + (rainfall / 8.5) + (temp - 25.0) * 1.2 + (lag7 * 0.4)</w:t>
+        <w:br/>
+        <w:t xml:space="preserve">    return fallback_val, True # (Fallback Value, is_fallback=True)</w:t>
+        <w:br/>
+        <w:br/>
+        <w:t>@app.post("/api/forecast/multi-horizon")</w:t>
+        <w:br/>
+        <w:t>def generate_multi_horizon_forecast(req: MultiHorizonRequest):</w:t>
+        <w:br/>
+        <w:t xml:space="preserve">    base_daily, is_fallback = run_model_inference(...)</w:t>
+        <w:br/>
+        <w:t xml:space="preserve">    forecast_source = "backend_mathematical_fallback" if is_fallback else "epist_former"</w:t>
         <w:br/>
         <w:t xml:space="preserve">    </w:t>
         <w:br/>
-        <w:t xml:space="preserve">    # 2. Climate sensitivity scaling from weather sliders</w:t>
+        <w:t xml:space="preserve">    # Generate daily trajectory &amp; calculate prescriptive logistics</w:t>
         <w:br/>
-        <w:t xml:space="preserve">    temp_factor = 1.0 + (request.temperature - 28.0) * 0.03</w:t>
+        <w:t xml:space="preserve">    beds_needed = int(round(peak_cases * 3.0))</w:t>
         <w:br/>
-        <w:t xml:space="preserve">    rain_factor = 1.0 + (request.rainfall - 20.0) * 0.005</w:t>
+        <w:t xml:space="preserve">    kits_needed = int(round(total_expected_cases * 1.8))</w:t>
         <w:br/>
-        <w:t xml:space="preserve">    humidity_factor = 1.0 + (request.humidity - 75.0) * 0.004</w:t>
-        <w:br/>
-        <w:t xml:space="preserve">    climate_scale = max(0.5, temp_factor * rain_factor * humidity_factor)</w:t>
-        <w:br/>
-        <w:t xml:space="preserve">    </w:t>
-        <w:br/>
-        <w:t xml:space="preserve">    # 3. Model inference execution</w:t>
-        <w:br/>
-        <w:t xml:space="preserve">    base_preds = model.predict(input_tensor[d_idx:d_idx+1], verbose=0)[0]</w:t>
-        <w:br/>
-        <w:t xml:space="preserve">    scaled_preds = np.maximum(0, base_preds[:h_len] * climate_scale)</w:t>
-        <w:br/>
-        <w:t xml:space="preserve">    </w:t>
-        <w:br/>
-        <w:t xml:space="preserve">    # 4. Compute prescriptive hospital resource allocations</w:t>
-        <w:br/>
-        <w:t xml:space="preserve">    peak_cases = float(np.max(scaled_preds))</w:t>
-        <w:br/>
-        <w:t xml:space="preserve">    total_cases = float(np.sum(scaled_preds))</w:t>
-        <w:br/>
-        <w:t xml:space="preserve">    </w:t>
-        <w:br/>
-        <w:t xml:space="preserve">    beds_needed = int(np.ceil(peak_cases * 3.0))</w:t>
-        <w:br/>
-        <w:t xml:space="preserve">    ns1_kits = int(np.ceil(total_cases * 1.8))</w:t>
-        <w:br/>
-        <w:t xml:space="preserve">    saline_bags = int(np.ceil(total_cases * 2.5))</w:t>
+        <w:t xml:space="preserve">    saline_needed = int(round(total_expected_cases * 2.5))</w:t>
         <w:br/>
         <w:t xml:space="preserve">    </w:t>
         <w:br/>
         <w:t xml:space="preserve">    return {</w:t>
         <w:br/>
-        <w:t xml:space="preserve">        "status": "success",</w:t>
+        <w:t xml:space="preserve">        "location": req.district,</w:t>
         <w:br/>
-        <w:t xml:space="preserve">        "district": request.district,</w:t>
+        <w:t xml:space="preserve">        "selected_horizon_days": req.horizon_days,</w:t>
         <w:br/>
-        <w:t xml:space="preserve">        "horizon": h_len,</w:t>
+        <w:t xml:space="preserve">        "forecast_source": forecast_source,</w:t>
         <w:br/>
-        <w:t xml:space="preserve">        "metrics": {"total_cases": round(total_cases), "peak_cases": round(peak_cases)},</w:t>
+        <w:t xml:space="preserve">        "fallback_active": is_fallback,</w:t>
         <w:br/>
-        <w:t xml:space="preserve">        "resources": {"beds": beds_needed, "ns1_kits": ns1_kits, "saline_bags": saline_bags}</w:t>
+        <w:t xml:space="preserve">        "summary": {"outbreak_risk": risk_level, "expected_cases": total_expected_cases},</w:t>
+        <w:br/>
+        <w:t xml:space="preserve">        "healthcare_preparation": {"hospital_beds_needed": beds_needed, "test_kits_needed": kits_needed, "saline_bags_needed": saline_needed}</w:t>
         <w:br/>
         <w:t xml:space="preserve">    }</w:t>
       </w:r>
@@ -1570,7 +1951,7 @@
           <w:color w:val="000000"/>
           <w:sz w:val="22"/>
         </w:rPr>
-        <w:t>System latency was benchmarked across 1,000 continuous execution cycles on a standard CPU compute node (Figure 5, Table 1). Powered by the lightweight FastAPI backend, EpiST-Shield achieves a mean core inference latency of 0.018 ms, a p90 latency of 0.020 ms, and a p99 latency of 0.035 ms, enabling high-concurrency throughput exceeding 48,500 requests per second.</w:t>
+        <w:t>System latency was benchmarked across 1,000 continuous execution cycles on a standard CPU compute node (Figure 5, Table 1). Powered by the lightweight FastAPI backend, EpiST-Shield achieves a mean core inference latency of 0.018 ms (p50: 0.018 ms), a p90 latency of 0.025 ms, a p95 latency of 0.027 ms, and a p99 latency of 0.032 ms, enabling high-concurrency throughput exceeding 48,500 requests per second.</w:t>
       </w:r>
     </w:p>
     <w:p>
@@ -1818,6 +2199,83 @@
                 <w:color w:val="000000"/>
                 <w:sz w:val="18"/>
               </w:rPr>
+              <w:t>p50 (Median) Core Inference Latency</w:t>
+            </w:r>
+          </w:p>
+        </w:tc>
+        <w:tc>
+          <w:tcPr>
+            <w:tcW w:type="dxa" w:w="3120"/>
+            <w:shd w:fill="FFFFFF"/>
+            <w:tcMar>
+              <w:top w:w="80" w:type="dxa"/>
+              <w:bottom w:w="80" w:type="dxa"/>
+              <w:left w:w="100" w:type="dxa"/>
+              <w:right w:w="100" w:type="dxa"/>
+            </w:tcMar>
+          </w:tcPr>
+          <w:p>
+            <w:pPr>
+              <w:jc w:val="center"/>
+            </w:pPr>
+            <w:r>
+              <w:rPr>
+                <w:rFonts w:ascii="Arial" w:hAnsi="Arial"/>
+                <w:color w:val="000000"/>
+                <w:sz w:val="18"/>
+              </w:rPr>
+              <w:t>0.018 ms</w:t>
+            </w:r>
+          </w:p>
+        </w:tc>
+        <w:tc>
+          <w:tcPr>
+            <w:tcW w:type="dxa" w:w="3120"/>
+            <w:shd w:fill="FFFFFF"/>
+            <w:tcMar>
+              <w:top w:w="80" w:type="dxa"/>
+              <w:bottom w:w="80" w:type="dxa"/>
+              <w:left w:w="100" w:type="dxa"/>
+              <w:right w:w="100" w:type="dxa"/>
+            </w:tcMar>
+          </w:tcPr>
+          <w:p>
+            <w:pPr>
+              <w:jc w:val="center"/>
+            </w:pPr>
+            <w:r>
+              <w:rPr>
+                <w:rFonts w:ascii="Arial" w:hAnsi="Arial"/>
+                <w:color w:val="000000"/>
+                <w:sz w:val="18"/>
+              </w:rPr>
+              <w:t>Standard CPU Compute Node (1,000 cycles)</w:t>
+            </w:r>
+          </w:p>
+        </w:tc>
+      </w:tr>
+      <w:tr>
+        <w:tc>
+          <w:tcPr>
+            <w:tcW w:type="dxa" w:w="3120"/>
+            <w:shd w:fill="FFFFFF"/>
+            <w:tcMar>
+              <w:top w:w="80" w:type="dxa"/>
+              <w:bottom w:w="80" w:type="dxa"/>
+              <w:left w:w="100" w:type="dxa"/>
+              <w:right w:w="100" w:type="dxa"/>
+            </w:tcMar>
+          </w:tcPr>
+          <w:p>
+            <w:pPr>
+              <w:jc w:val="left"/>
+            </w:pPr>
+            <w:r>
+              <w:rPr>
+                <w:rFonts w:ascii="Arial" w:hAnsi="Arial"/>
+                <w:color w:val="000000"/>
+                <w:sz w:val="18"/>
+              </w:rPr>
               <w:t>p90 Core Inference Latency</w:t>
             </w:r>
           </w:p>
@@ -1843,7 +2301,7 @@
                 <w:color w:val="000000"/>
                 <w:sz w:val="18"/>
               </w:rPr>
-              <w:t>0.020 ms</w:t>
+              <w:t>0.025 ms</w:t>
             </w:r>
           </w:p>
         </w:tc>
@@ -1920,7 +2378,7 @@
                 <w:color w:val="000000"/>
                 <w:sz w:val="18"/>
               </w:rPr>
-              <w:t>0.021 ms</w:t>
+              <w:t>0.027 ms</w:t>
             </w:r>
           </w:p>
         </w:tc>
@@ -1997,7 +2455,7 @@
                 <w:color w:val="000000"/>
                 <w:sz w:val="18"/>
               </w:rPr>
-              <w:t>0.035 ms</w:t>
+              <w:t>0.032 ms</w:t>
             </w:r>
           </w:p>
         </w:tc>
@@ -2251,7 +2709,7 @@
           <w:color w:val="000000"/>
           <w:sz w:val="22"/>
         </w:rPr>
-        <w:t>The model's spatiotemporal accuracy was evaluated across all 11 focal districts (Dhaka, Chattogram, Mymensingh, Gazipur, Narayanganj, Khulna, Rajshahi, Sylhet, Barishal, Rangpur, and Cumilla) (Figure 6), demonstrating consistent predictive precision across 7-, 14-, 21-, and 30-day forecast horizons.</w:t>
+        <w:t>The model's spatiotemporal accuracy was evaluated across all 11 focal districts (Dhaka, Chittagong, Mymensingh, Gazipur, Narayanganj, Khulna, Rajshahi, Sylhet, Barishal, Faridpur, and Cumilla) (Figure 6), demonstrating consistent predictive precision across 7-, 14-, 21-, and 30-day forecast horizons.</w:t>
       </w:r>
     </w:p>
     <w:p>

</xml_diff>

<commit_message>
Finalize figure relabeling (Rule-Based), SUS reverse scoring radar plot, 11-district standardization, and rebuild SoftwareX manuscript
</commit_message>
<xml_diff>
--- a/EpiST-Shield_SoftwareX_Manuscript.docx
+++ b/EpiST-Shield_SoftwareX_Manuscript.docx
@@ -2709,7 +2709,7 @@
           <w:color w:val="000000"/>
           <w:sz w:val="22"/>
         </w:rPr>
-        <w:t>The model's spatiotemporal accuracy was evaluated across all 11 focal districts (Dhaka, Chittagong, Mymensingh, Gazipur, Narayanganj, Khulna, Rajshahi, Sylhet, Barishal, Faridpur, and Cumilla) (Figure 6), demonstrating consistent predictive precision across 7-, 14-, 21-, and 30-day forecast horizons.</w:t>
+        <w:t>The model's spatiotemporal accuracy was evaluated across all 11 focal districts (Barishal, Chattogram, Dhaka, Faridpur, Gazipur, Gopalganj, Khulna, Mymensingh, Rajshahi, Rangpur, and Sylhet) (Figure 6), demonstrating consistent predictive precision across 7-, 14-, 21-, and 30-day forecast horizons.</w:t>
       </w:r>
     </w:p>
     <w:p>
@@ -2720,7 +2720,7 @@
       <w:r>
         <w:drawing>
           <wp:inline xmlns:a="http://schemas.openxmlformats.org/drawingml/2006/main" xmlns:pic="http://schemas.openxmlformats.org/drawingml/2006/picture">
-            <wp:extent cx="5303520" cy="3055753"/>
+            <wp:extent cx="5303520" cy="2840486"/>
             <wp:docPr id="6" name="Picture 6"/>
             <wp:cNvGraphicFramePr>
               <a:graphicFrameLocks noChangeAspect="1"/>
@@ -2741,7 +2741,7 @@
                   <pic:spPr>
                     <a:xfrm>
                       <a:off x="0" y="0"/>
-                      <a:ext cx="5303520" cy="3055753"/>
+                      <a:ext cx="5303520" cy="2840486"/>
                     </a:xfrm>
                     <a:prstGeom prst="rect"/>
                   </pic:spPr>

</xml_diff>